<commit_message>
test: make Word fixtures reproducible with standard package relationships
</commit_message>
<xml_diff>
--- a/tests/fixtures/scripts/initial-draft.docx
+++ b/tests/fixtures/scripts/initial-draft.docx
@@ -1,6 +1,6 @@
 
 <file path=word/document.xml><?xml version="1.0" encoding="utf-8"?>
-<w:document xmlns:w="http://schemas.openxmlformats.org/wordprocessingml/2006/main" xmlns:a="http://schemas.openxmlformats.org/drawingml/2006/main" xmlns:r="http://schemas.openxmlformats.org/officeDocument/2006/relationships">
+<w:document xmlns:w="http://schemas.openxmlformats.org/wordprocessingml/2006/main" xmlns:a="http://schemas.openxmlformats.org/drawingml/2006/main" xmlns:r="http://schemas.openxmlformats.org/officeDocument/2006/relationships" xmlns:wp="http://schemas.openxmlformats.org/drawingml/2006/wordprocessingDrawing" xmlns:pic="http://schemas.openxmlformats.org/drawingml/2006/picture">
   <w:body>
     <w:p>
       <w:pPr>
@@ -36,7 +36,38 @@
     <w:p>
       <w:r>
         <w:drawing>
-          <a:blip r:embed="image1"/>
+          <wp:inline distT="0" distB="0" distL="0" distR="0">
+            <wp:extent cx="9525" cy="9525"/>
+            <wp:docPr id="1" name="Synthetic pixel"/>
+            <wp:cNvGraphicFramePr>
+              <a:graphicFrameLocks noChangeAspect="1"/>
+            </wp:cNvGraphicFramePr>
+            <a:graphic>
+              <a:graphicData uri="http://schemas.openxmlformats.org/drawingml/2006/picture">
+                <pic:pic>
+                  <pic:nvPicPr>
+                    <pic:cNvPr id="0" name="image1.png"/>
+                    <pic:cNvPicPr/>
+                  </pic:nvPicPr>
+                  <pic:blipFill>
+                    <a:blip r:embed="image1"/>
+                    <a:stretch>
+                      <a:fillRect/>
+                    </a:stretch>
+                  </pic:blipFill>
+                  <pic:spPr>
+                    <a:xfrm>
+                      <a:off x="0" y="0"/>
+                      <a:ext cx="9525" cy="9525"/>
+                    </a:xfrm>
+                    <a:prstGeom prst="rect">
+                      <a:avLst/>
+                    </a:prstGeom>
+                  </pic:spPr>
+                </pic:pic>
+              </a:graphicData>
+            </a:graphic>
+          </wp:inline>
         </w:drawing>
       </w:r>
     </w:p>

</xml_diff>